<commit_message>
publish report and remove temporary tools
</commit_message>
<xml_diff>
--- a/1030425220_张子昂_EasyBomber.docx
+++ b/1030425220_张子昂_EasyBomber.docx
@@ -53,6 +53,7 @@
         <w:spacing w:after="200"/>
         <w:jc w:val="center"/>
       </w:pPr>
+      <w:proofErr w:type="spellStart"/>
       <w:r>
         <w:rPr>
           <w:rFonts w:ascii="黑体" w:hAnsi="黑体"/>
@@ -62,6 +63,7 @@
         </w:rPr>
         <w:t>简易炸弹人</w:t>
       </w:r>
+      <w:proofErr w:type="spellEnd"/>
     </w:p>
     <w:p>
       <w:pPr>
@@ -413,12 +415,14 @@
             <w:pPr>
               <w:jc w:val="center"/>
             </w:pPr>
-            <w:hyperlink r:id="rId9" w:history="1">
+            <w:hyperlink r:id="rIdGithub1" w:history="1">
               <w:r>
                 <w:rPr>
-                  <w:rStyle w:val="aff9"/>
+                  <w:rFonts w:eastAsia="SimSun" w:ascii="Times New Roman" w:hAnsi="Times New Roman"/>
+                  <w:color w:val="0563C1"/>
+                  <w:u w:val="single"/>
                 </w:rPr>
-                <w:t>________________________________</w:t>
+                <w:t>https://github.com/TONYCHARLES-52151314/EasyBomber</w:t>
               </w:r>
             </w:hyperlink>
           </w:p>
@@ -1628,11 +1632,33 @@
           <w:lang w:eastAsia="zh-CN"/>
         </w:rPr>
       </w:pPr>
+      <w:proofErr w:type="spellStart"/>
       <w:r>
         <w:rPr>
           <w:lang w:eastAsia="zh-CN"/>
         </w:rPr>
-        <w:t>EasyBomber 是一个使用 C++17 和 EasyX 图形库实现的单人炸弹人小游戏。玩家在 15×21 的网格地图中移动，通过放置定时炸弹清除可破坏砖块并消灭全部怪物。项目采用 Visual Studio C++ 桌面工程组织，地图、玩家、怪物、炸弹和爆炸效果分别由独立类负责。</w:t>
+        <w:t>EasyBomber</w:t>
+      </w:r>
+      <w:proofErr w:type="spellEnd"/>
+      <w:r>
+        <w:rPr>
+          <w:lang w:eastAsia="zh-CN"/>
+        </w:rPr>
+        <w:t xml:space="preserve"> 是一个使用 C++17 和 </w:t>
+      </w:r>
+      <w:proofErr w:type="spellStart"/>
+      <w:r>
+        <w:rPr>
+          <w:lang w:eastAsia="zh-CN"/>
+        </w:rPr>
+        <w:t>EasyX</w:t>
+      </w:r>
+      <w:proofErr w:type="spellEnd"/>
+      <w:r>
+        <w:rPr>
+          <w:lang w:eastAsia="zh-CN"/>
+        </w:rPr>
+        <w:t xml:space="preserve"> 图形库实现的单人炸弹人小游戏。玩家在 15×21 的网格地图中移动，通过放置定时炸弹清除可破坏砖块并消灭全部怪物。项目采用 Visual Studio C++ 桌面工程组织，地图、玩家、怪物、炸弹和爆炸效果分别由独立类负责。</w:t>
       </w:r>
     </w:p>
     <w:p>
@@ -1725,10 +1751,12 @@
       <w:r>
         <w:t xml:space="preserve">1.1 </w:t>
       </w:r>
+      <w:proofErr w:type="spellStart"/>
       <w:r>
         <w:t>运行截图</w:t>
       </w:r>
       <w:bookmarkEnd w:id="1"/>
+      <w:proofErr w:type="spellEnd"/>
     </w:p>
     <w:tbl>
       <w:tblPr>
@@ -1888,7 +1916,25 @@
           <w:sz w:val="18"/>
           <w:lang w:eastAsia="zh-CN"/>
         </w:rPr>
-        <w:t>图 1  EasyBomber 运行效果（请插入两张本人实际运行截图）</w:t>
+        <w:t xml:space="preserve">图 1  </w:t>
+      </w:r>
+      <w:proofErr w:type="spellStart"/>
+      <w:r>
+        <w:rPr>
+          <w:color w:val="666666"/>
+          <w:sz w:val="18"/>
+          <w:lang w:eastAsia="zh-CN"/>
+        </w:rPr>
+        <w:t>EasyBomber</w:t>
+      </w:r>
+      <w:proofErr w:type="spellEnd"/>
+      <w:r>
+        <w:rPr>
+          <w:color w:val="666666"/>
+          <w:sz w:val="18"/>
+          <w:lang w:eastAsia="zh-CN"/>
+        </w:rPr>
+        <w:t xml:space="preserve"> 运行效果（请插入两张本人实际运行截图）</w:t>
       </w:r>
     </w:p>
     <w:p>
@@ -1958,10 +2004,12 @@
       <w:r>
         <w:t xml:space="preserve">2.1 </w:t>
       </w:r>
+      <w:proofErr w:type="spellStart"/>
       <w:r>
         <w:t>类继承图</w:t>
       </w:r>
       <w:bookmarkEnd w:id="3"/>
+      <w:proofErr w:type="spellEnd"/>
     </w:p>
     <w:p>
       <w:pPr>
@@ -2046,7 +2094,15 @@
         </w:rPr>
       </w:pPr>
       <w:r>
-        <w:t>GameObject 抽取了所有动态游戏对象共有的网格位置 pos、活动标记 active，以及 update(int dt, const Map&amp;) 和 draw() 两个行为接口。</w:t>
+        <w:t xml:space="preserve">GameObject 抽取了所有动态游戏对象共有的网格位置 pos、活动标记 active，以及 update(int dt, const Map&amp;) 和 draw() </w:t>
+      </w:r>
+      <w:proofErr w:type="spellStart"/>
+      <w:r>
+        <w:t>两个行为接口</w:t>
+      </w:r>
+      <w:proofErr w:type="spellEnd"/>
+      <w:r>
+        <w:t>。</w:t>
       </w:r>
       <w:r>
         <w:rPr>
@@ -2078,10 +2134,12 @@
       <w:r>
         <w:t xml:space="preserve">2.3 </w:t>
       </w:r>
+      <w:proofErr w:type="spellStart"/>
       <w:r>
         <w:t>派生类职责</w:t>
       </w:r>
       <w:bookmarkEnd w:id="5"/>
+      <w:proofErr w:type="spellEnd"/>
     </w:p>
     <w:tbl>
       <w:tblPr>
@@ -2297,7 +2355,23 @@
                 <w:sz w:val="18"/>
                 <w:lang w:eastAsia="zh-CN"/>
               </w:rPr>
-              <w:t>按固定路径巡逻；按 450 ms 节拍移动；遇阻等待</w:t>
+              <w:t xml:space="preserve">按固定路径巡逻；按 450 </w:t>
+            </w:r>
+            <w:proofErr w:type="spellStart"/>
+            <w:r>
+              <w:rPr>
+                <w:sz w:val="18"/>
+                <w:lang w:eastAsia="zh-CN"/>
+              </w:rPr>
+              <w:t>ms</w:t>
+            </w:r>
+            <w:proofErr w:type="spellEnd"/>
+            <w:r>
+              <w:rPr>
+                <w:sz w:val="18"/>
+                <w:lang w:eastAsia="zh-CN"/>
+              </w:rPr>
+              <w:t xml:space="preserve"> 节拍移动；遇阻等待</w:t>
             </w:r>
           </w:p>
         </w:tc>
@@ -2436,7 +2510,23 @@
                 <w:sz w:val="18"/>
                 <w:lang w:eastAsia="zh-CN"/>
               </w:rPr>
-              <w:t>保存爆炸波及格；判断命中；450 ms 后自动失效</w:t>
+              <w:t xml:space="preserve">保存爆炸波及格；判断命中；450 </w:t>
+            </w:r>
+            <w:proofErr w:type="spellStart"/>
+            <w:r>
+              <w:rPr>
+                <w:sz w:val="18"/>
+                <w:lang w:eastAsia="zh-CN"/>
+              </w:rPr>
+              <w:t>ms</w:t>
+            </w:r>
+            <w:proofErr w:type="spellEnd"/>
+            <w:r>
+              <w:rPr>
+                <w:sz w:val="18"/>
+                <w:lang w:eastAsia="zh-CN"/>
+              </w:rPr>
+              <w:t xml:space="preserve"> 后自动失效</w:t>
             </w:r>
           </w:p>
         </w:tc>
@@ -2515,12 +2605,17 @@
         <w:t>与</w:t>
       </w:r>
       <w:r>
-        <w:t xml:space="preserve"> Map</w:t>
+        <w:t xml:space="preserve"> </w:t>
+      </w:r>
+      <w:proofErr w:type="spellStart"/>
+      <w:r>
+        <w:t>Map</w:t>
       </w:r>
       <w:r>
         <w:t>：组合优于继承</w:t>
       </w:r>
       <w:bookmarkEnd w:id="6"/>
+      <w:proofErr w:type="spellEnd"/>
     </w:p>
     <w:p>
       <w:pPr>
@@ -2531,13 +2626,104 @@
         </w:rPr>
       </w:pPr>
       <w:r>
-        <w:t>Game 不是某一种游戏对象，而是流程编排者，因此没有继承 GameObject。它组合一个 Map、一个 unique_ptr&lt;Player&gt;，以及一个 vector&lt;unique_ptr&lt;GameObject&gt;&gt; 动态对象集合，按“输入—更新—碰撞—清理—绘制”的顺序推进每一帧。</w:t>
+        <w:t>Game 不是某一种游戏对象，而是流程编排者，因此没有继承 GameObject。</w:t>
+      </w:r>
+      <w:proofErr w:type="spellStart"/>
+      <w:r>
+        <w:t>它组合一个</w:t>
+      </w:r>
+      <w:proofErr w:type="spellEnd"/>
+      <w:r>
+        <w:t xml:space="preserve"> </w:t>
+      </w:r>
+      <w:proofErr w:type="spellStart"/>
+      <w:r>
+        <w:t>Map、一个</w:t>
+      </w:r>
+      <w:proofErr w:type="spellEnd"/>
+      <w:r>
+        <w:t xml:space="preserve"> </w:t>
+      </w:r>
+      <w:proofErr w:type="spellStart"/>
+      <w:r>
+        <w:t>unique_ptr</w:t>
+      </w:r>
+      <w:proofErr w:type="spellEnd"/>
+      <w:r>
+        <w:t>&lt;Player&gt;，</w:t>
+      </w:r>
+      <w:proofErr w:type="spellStart"/>
+      <w:r>
+        <w:t>以及一个</w:t>
+      </w:r>
+      <w:proofErr w:type="spellEnd"/>
+      <w:r>
+        <w:t xml:space="preserve"> vector&lt;</w:t>
+      </w:r>
+      <w:proofErr w:type="spellStart"/>
+      <w:r>
+        <w:t>unique_ptr</w:t>
+      </w:r>
+      <w:proofErr w:type="spellEnd"/>
+      <w:r>
+        <w:t>&lt;</w:t>
+      </w:r>
+      <w:proofErr w:type="spellStart"/>
+      <w:r>
+        <w:t>GameObject</w:t>
+      </w:r>
+      <w:proofErr w:type="spellEnd"/>
+      <w:r>
+        <w:t xml:space="preserve">&gt;&gt; </w:t>
+      </w:r>
+      <w:proofErr w:type="spellStart"/>
+      <w:r>
+        <w:t>动态对象集合，按“输入</w:t>
+      </w:r>
+      <w:proofErr w:type="spellEnd"/>
+      <w:r>
+        <w:t>—</w:t>
+      </w:r>
+      <w:proofErr w:type="spellStart"/>
+      <w:r>
+        <w:t>更新</w:t>
+      </w:r>
+      <w:proofErr w:type="spellEnd"/>
+      <w:r>
+        <w:t>—</w:t>
+      </w:r>
+      <w:proofErr w:type="spellStart"/>
+      <w:r>
+        <w:t>碰撞</w:t>
+      </w:r>
+      <w:proofErr w:type="spellEnd"/>
+      <w:r>
+        <w:t>—</w:t>
+      </w:r>
+      <w:proofErr w:type="spellStart"/>
+      <w:r>
+        <w:t>清理</w:t>
+      </w:r>
+      <w:proofErr w:type="spellEnd"/>
+      <w:r>
+        <w:t>—</w:t>
+      </w:r>
+      <w:proofErr w:type="spellStart"/>
+      <w:r>
+        <w:t>绘制”的顺序推进每一帧。</w:t>
       </w:r>
       <w:r>
         <w:rPr>
           <w:lang w:eastAsia="zh-CN"/>
         </w:rPr>
-        <w:t>Map 同样不是动态实体，它负责二维地图数据、出生点、道路判定、砖块破坏和爆炸传播计算。</w:t>
+        <w:t>Map</w:t>
+      </w:r>
+      <w:proofErr w:type="spellEnd"/>
+      <w:r>
+        <w:rPr>
+          <w:lang w:eastAsia="zh-CN"/>
+        </w:rPr>
+        <w:t xml:space="preserve"> 同样不是动态实体，它负责二维地图数据、出生点、道路判定、砖块破坏和爆炸传播计算。</w:t>
       </w:r>
     </w:p>
     <w:p>
@@ -2548,8 +2734,53 @@
           <w:lang w:eastAsia="zh-CN"/>
         </w:rPr>
       </w:pPr>
-      <w:r>
-        <w:t>这一结构体现了“is-a 用继承，has-a 用组合”的原则：Monster 是一种 GameObject，所以采用继承；Game 拥有地图和对象，所以采用组合。</w:t>
+      <w:proofErr w:type="spellStart"/>
+      <w:r>
+        <w:t>这一结构体现了“is</w:t>
+      </w:r>
+      <w:proofErr w:type="spellEnd"/>
+      <w:r>
+        <w:t xml:space="preserve">-a </w:t>
+      </w:r>
+      <w:proofErr w:type="spellStart"/>
+      <w:r>
+        <w:t>用继承，has-a</w:t>
+      </w:r>
+      <w:proofErr w:type="spellEnd"/>
+      <w:r>
+        <w:t xml:space="preserve"> </w:t>
+      </w:r>
+      <w:proofErr w:type="spellStart"/>
+      <w:r>
+        <w:t>用组合”的原则：Monster</w:t>
+      </w:r>
+      <w:proofErr w:type="spellEnd"/>
+      <w:r>
+        <w:t xml:space="preserve"> </w:t>
+      </w:r>
+      <w:proofErr w:type="spellStart"/>
+      <w:r>
+        <w:t>是一种</w:t>
+      </w:r>
+      <w:proofErr w:type="spellEnd"/>
+      <w:r>
+        <w:t xml:space="preserve"> </w:t>
+      </w:r>
+      <w:proofErr w:type="spellStart"/>
+      <w:r>
+        <w:t>GameObject，所以采用继承；Game</w:t>
+      </w:r>
+      <w:proofErr w:type="spellEnd"/>
+      <w:r>
+        <w:t xml:space="preserve"> </w:t>
+      </w:r>
+      <w:proofErr w:type="spellStart"/>
+      <w:r>
+        <w:t>拥有地图和对象，所以采用组合</w:t>
+      </w:r>
+      <w:proofErr w:type="spellEnd"/>
+      <w:r>
+        <w:t>。</w:t>
       </w:r>
       <w:r>
         <w:rPr>
@@ -2566,10 +2797,12 @@
       <w:r>
         <w:t xml:space="preserve">2.5 </w:t>
       </w:r>
+      <w:proofErr w:type="spellStart"/>
       <w:r>
         <w:t>虚函数如何体现多态</w:t>
       </w:r>
       <w:bookmarkEnd w:id="7"/>
+      <w:proofErr w:type="spellEnd"/>
     </w:p>
     <w:p>
       <w:pPr>
@@ -2618,18 +2851,63 @@
             <w:pPr>
               <w:spacing w:before="80" w:after="80"/>
             </w:pPr>
+            <w:proofErr w:type="spellStart"/>
             <w:r>
               <w:rPr>
                 <w:b/>
                 <w:color w:val="17365D"/>
               </w:rPr>
-              <w:t xml:space="preserve">设计价值  </w:t>
+              <w:t>设计价值</w:t>
             </w:r>
+            <w:proofErr w:type="spellEnd"/>
+            <w:r>
+              <w:rPr>
+                <w:b/>
+                <w:color w:val="17365D"/>
+              </w:rPr>
+              <w:t xml:space="preserve">  </w:t>
+            </w:r>
+            <w:proofErr w:type="spellStart"/>
             <w:r>
               <w:rPr>
                 <w:sz w:val="20"/>
               </w:rPr>
-              <w:t>新增一种动态对象时，只需继承 GameObject 并实现 update/draw，再放入 objects 容器；Game 的通用更新和绘制循环无需改写。</w:t>
+              <w:t>新增一种动态对象时，只需继承</w:t>
+            </w:r>
+            <w:proofErr w:type="spellEnd"/>
+            <w:r>
+              <w:rPr>
+                <w:sz w:val="20"/>
+              </w:rPr>
+              <w:t xml:space="preserve"> </w:t>
+            </w:r>
+            <w:proofErr w:type="spellStart"/>
+            <w:r>
+              <w:rPr>
+                <w:sz w:val="20"/>
+              </w:rPr>
+              <w:t>GameObject</w:t>
+            </w:r>
+            <w:proofErr w:type="spellEnd"/>
+            <w:r>
+              <w:rPr>
+                <w:sz w:val="20"/>
+              </w:rPr>
+              <w:t xml:space="preserve"> </w:t>
+            </w:r>
+            <w:proofErr w:type="spellStart"/>
+            <w:r>
+              <w:rPr>
+                <w:sz w:val="20"/>
+              </w:rPr>
+              <w:t>并实现</w:t>
+            </w:r>
+            <w:proofErr w:type="spellEnd"/>
+            <w:r>
+              <w:rPr>
+                <w:sz w:val="20"/>
+              </w:rPr>
+              <w:t xml:space="preserve"> update/draw，再放入 objects 容器；Game 的通用更新和绘制循环无需改写。</w:t>
             </w:r>
           </w:p>
         </w:tc>
@@ -2665,7 +2943,35 @@
         <w:rPr>
           <w:lang w:eastAsia="zh-CN"/>
         </w:rPr>
-        <w:t>通用行为通过虚函数处理；只有“仅属于某一种类型”的业务操作才使用 dynamic_cast。例如引爆阶段需要调用 Bomb::isReady()，碰撞阶段需要调用 Explosion::hits()，统计阶段需要识别 Monster。这样的使用范围较小，避免把所有逻辑都退化为类型判断。若后续扩展，可进一步使用对象类别枚举、事件系统或双分派减少类型转换。</w:t>
+        <w:t xml:space="preserve">通用行为通过虚函数处理；只有“仅属于某一种类型”的业务操作才使用 </w:t>
+      </w:r>
+      <w:proofErr w:type="spellStart"/>
+      <w:r>
+        <w:rPr>
+          <w:lang w:eastAsia="zh-CN"/>
+        </w:rPr>
+        <w:t>dynamic_cast</w:t>
+      </w:r>
+      <w:proofErr w:type="spellEnd"/>
+      <w:r>
+        <w:rPr>
+          <w:lang w:eastAsia="zh-CN"/>
+        </w:rPr>
+        <w:t>。例如引爆阶段需要调用 Bomb::</w:t>
+      </w:r>
+      <w:proofErr w:type="spellStart"/>
+      <w:r>
+        <w:rPr>
+          <w:lang w:eastAsia="zh-CN"/>
+        </w:rPr>
+        <w:t>isReady</w:t>
+      </w:r>
+      <w:proofErr w:type="spellEnd"/>
+      <w:r>
+        <w:rPr>
+          <w:lang w:eastAsia="zh-CN"/>
+        </w:rPr>
+        <w:t>()，碰撞阶段需要调用 Explosion::hits()，统计阶段需要识别 Monster。这样的使用范围较小，避免把所有逻辑都退化为类型判断。若后续扩展，可进一步使用对象类别枚举、事件系统或双分派减少类型转换。</w:t>
       </w:r>
     </w:p>
     <w:p>
@@ -2676,9 +2982,11 @@
       <w:r>
         <w:t xml:space="preserve">2.7 </w:t>
       </w:r>
+      <w:proofErr w:type="spellStart"/>
       <w:r>
         <w:t>如果不使用</w:t>
       </w:r>
+      <w:proofErr w:type="spellEnd"/>
       <w:r>
         <w:t xml:space="preserve"> OOP</w:t>
       </w:r>
@@ -2826,11 +3134,33 @@
             </w:tcBorders>
           </w:tcPr>
           <w:p>
+            <w:proofErr w:type="spellStart"/>
             <w:r>
               <w:rPr>
                 <w:sz w:val="18"/>
               </w:rPr>
-              <w:t>状态封装在 Player、Monster、Bomb、Explosion 内</w:t>
+              <w:t>状态封装在</w:t>
+            </w:r>
+            <w:proofErr w:type="spellEnd"/>
+            <w:r>
+              <w:rPr>
+                <w:sz w:val="18"/>
+              </w:rPr>
+              <w:t xml:space="preserve"> </w:t>
+            </w:r>
+            <w:proofErr w:type="spellStart"/>
+            <w:r>
+              <w:rPr>
+                <w:sz w:val="18"/>
+              </w:rPr>
+              <w:t>Player、Monster、Bomb、Explosion</w:t>
+            </w:r>
+            <w:proofErr w:type="spellEnd"/>
+            <w:r>
+              <w:rPr>
+                <w:sz w:val="18"/>
+              </w:rPr>
+              <w:t xml:space="preserve"> 内</w:t>
             </w:r>
           </w:p>
         </w:tc>
@@ -2921,12 +3251,14 @@
             </w:tcBorders>
           </w:tcPr>
           <w:p>
+            <w:proofErr w:type="spellStart"/>
             <w:r>
               <w:rPr>
                 <w:sz w:val="18"/>
               </w:rPr>
               <w:t>扩展维护</w:t>
             </w:r>
+            <w:proofErr w:type="spellEnd"/>
           </w:p>
         </w:tc>
         <w:tc>
@@ -3099,7 +3431,21 @@
         <w:rPr>
           <w:lang w:eastAsia="zh-CN"/>
         </w:rPr>
-        <w:t>项目使用 vector 保存怪物路线、爆炸覆盖格、地图二维数据和动态对象集合。与固定长度 C 数组相比，vector 能根据 push_back 自动扩容，并通过 size() 提供当前元素数量，适合怪物死亡、炸弹生成和爆炸消失这类运行期变化。传统写法需要预估最大容量、维护计数变量，并在插入删除时手工移动元素，容易越界或出现计数不同步。</w:t>
+        <w:t xml:space="preserve">项目使用 vector 保存怪物路线、爆炸覆盖格、地图二维数据和动态对象集合。与固定长度 C 数组相比，vector 能根据 </w:t>
+      </w:r>
+      <w:proofErr w:type="spellStart"/>
+      <w:r>
+        <w:rPr>
+          <w:lang w:eastAsia="zh-CN"/>
+        </w:rPr>
+        <w:t>push_back</w:t>
+      </w:r>
+      <w:proofErr w:type="spellEnd"/>
+      <w:r>
+        <w:rPr>
+          <w:lang w:eastAsia="zh-CN"/>
+        </w:rPr>
+        <w:t xml:space="preserve"> 自动扩容，并通过 size() 提供当前元素数量，适合怪物死亡、炸弹生成和爆炸消失这类运行期变化。传统写法需要预估最大容量、维护计数变量，并在插入删除时手工移动元素，容易越界或出现计数不同步。</w:t>
       </w:r>
     </w:p>
     <w:p>
@@ -3381,16 +3727,32 @@
       </w:pPr>
       <w:bookmarkStart w:id="13" w:name="toc_44dc55b4"/>
       <w:r>
-        <w:t xml:space="preserve">3.3 unique_ptr </w:t>
+        <w:t xml:space="preserve">3.3 </w:t>
+      </w:r>
+      <w:proofErr w:type="spellStart"/>
+      <w:r>
+        <w:t>unique_ptr</w:t>
+      </w:r>
+      <w:proofErr w:type="spellEnd"/>
+      <w:r>
+        <w:t xml:space="preserve"> </w:t>
       </w:r>
       <w:r>
         <w:t>与</w:t>
       </w:r>
       <w:r>
-        <w:t xml:space="preserve"> make_unique</w:t>
-      </w:r>
-      <w:r>
-        <w:t>（重点）</w:t>
+        <w:t xml:space="preserve"> </w:t>
+      </w:r>
+      <w:proofErr w:type="spellStart"/>
+      <w:r>
+        <w:t>make_unique</w:t>
+      </w:r>
+      <w:r>
+        <w:t>（重点</w:t>
+      </w:r>
+      <w:proofErr w:type="spellEnd"/>
+      <w:r>
+        <w:t>）</w:t>
       </w:r>
       <w:bookmarkEnd w:id="13"/>
     </w:p>
@@ -3457,22 +3819,57 @@
         <w:rPr>
           <w:lang w:eastAsia="zh-CN"/>
         </w:rPr>
-        <w:t>如果使用传统裸指针，Game 需要在 reset()、正常退出、对象死亡和异常路径中手动 delete；任何遗漏都可能造成内存泄漏，重复释放又可能导致程序崩溃。unique_ptr 在离开作用域或从 vector 中擦除时自动析构对象，资源生命周期与容器生命周期绑定，符合 RAII 思想。</w:t>
-      </w:r>
-    </w:p>
-    <w:p>
-      <w:pPr>
-        <w:ind w:firstLine="420"/>
-        <w:jc w:val="both"/>
-      </w:pPr>
+        <w:t>如果使用传统裸指针，Game 需要在 reset()、正常退出、对象死亡和异常路径中手动 delete；任何遗漏都可能造成内存泄漏，重复释放又可能导致程序崩溃。</w:t>
+      </w:r>
+      <w:proofErr w:type="spellStart"/>
       <w:r>
         <w:rPr>
           <w:lang w:eastAsia="zh-CN"/>
         </w:rPr>
-        <w:t>make_unique 还把“分配内存”和“交给智能指针管理”合并成一个表达式，避免 new 与所有权接管之间出现异常窗口。</w:t>
-      </w:r>
-      <w:r>
-        <w:t>objects.push_back(make_unique&lt;Monster&gt;(...)) 同时清楚表达：创建一个 Monster，并把它的唯一所有权转移给 objects。</w:t>
+        <w:t>unique_ptr</w:t>
+      </w:r>
+      <w:proofErr w:type="spellEnd"/>
+      <w:r>
+        <w:rPr>
+          <w:lang w:eastAsia="zh-CN"/>
+        </w:rPr>
+        <w:t xml:space="preserve"> 在离开作用域或从 vector 中擦除时自动析构对象，资源生命周期与容器生命周期绑定，符合 RAII 思想。</w:t>
+      </w:r>
+    </w:p>
+    <w:p>
+      <w:pPr>
+        <w:ind w:firstLine="420"/>
+        <w:jc w:val="both"/>
+      </w:pPr>
+      <w:proofErr w:type="spellStart"/>
+      <w:r>
+        <w:rPr>
+          <w:lang w:eastAsia="zh-CN"/>
+        </w:rPr>
+        <w:t>make_unique</w:t>
+      </w:r>
+      <w:proofErr w:type="spellEnd"/>
+      <w:r>
+        <w:rPr>
+          <w:lang w:eastAsia="zh-CN"/>
+        </w:rPr>
+        <w:t xml:space="preserve"> 还把“分配内存”和“交给智能指针管理”合并成一个表达式，避免 new 与所有权接管之间出现异常窗口。</w:t>
+      </w:r>
+      <w:proofErr w:type="spellStart"/>
+      <w:r>
+        <w:t>objects.push_back</w:t>
+      </w:r>
+      <w:proofErr w:type="spellEnd"/>
+      <w:r>
+        <w:t>(</w:t>
+      </w:r>
+      <w:proofErr w:type="spellStart"/>
+      <w:r>
+        <w:t>make_unique</w:t>
+      </w:r>
+      <w:proofErr w:type="spellEnd"/>
+      <w:r>
+        <w:t>&lt;Monster&gt;(...)) 同时清楚表达：创建一个 Monster，并把它的唯一所有权转移给 objects。</w:t>
       </w:r>
     </w:p>
     <w:p>
@@ -3641,7 +4038,55 @@
         </w:rPr>
       </w:pPr>
       <w:r>
-        <w:t>GridPosition 使用聚合初始化 GridPosition p{row, col}，语义直接且避免字段遗漏；派生类方法使用 override，编译器可以检查函数签名是否真正重写基类虚函数；GameObject 的析构函数写成 virtual ~GameObject() = default，既保证多态析构，又避免无意义的手写空函数。</w:t>
+        <w:t xml:space="preserve">GridPosition 使用聚合初始化 </w:t>
+      </w:r>
+      <w:proofErr w:type="spellStart"/>
+      <w:r>
+        <w:t>GridPosition</w:t>
+      </w:r>
+      <w:proofErr w:type="spellEnd"/>
+      <w:r>
+        <w:t xml:space="preserve"> p{row, col}，</w:t>
+      </w:r>
+      <w:proofErr w:type="spellStart"/>
+      <w:r>
+        <w:t>语义直接且避免字段遗漏；派生类方法使用</w:t>
+      </w:r>
+      <w:proofErr w:type="spellEnd"/>
+      <w:r>
+        <w:t xml:space="preserve"> </w:t>
+      </w:r>
+      <w:proofErr w:type="spellStart"/>
+      <w:r>
+        <w:t>override，编译器可以检查函数签名是否真正重写基类虚函数；GameObject</w:t>
+      </w:r>
+      <w:proofErr w:type="spellEnd"/>
+      <w:r>
+        <w:t xml:space="preserve"> </w:t>
+      </w:r>
+      <w:proofErr w:type="spellStart"/>
+      <w:r>
+        <w:t>的析构函数写成</w:t>
+      </w:r>
+      <w:proofErr w:type="spellEnd"/>
+      <w:r>
+        <w:t xml:space="preserve"> virtual ~</w:t>
+      </w:r>
+      <w:proofErr w:type="spellStart"/>
+      <w:r>
+        <w:t>GameObject</w:t>
+      </w:r>
+      <w:proofErr w:type="spellEnd"/>
+      <w:r>
+        <w:t xml:space="preserve">() = </w:t>
+      </w:r>
+      <w:proofErr w:type="spellStart"/>
+      <w:r>
+        <w:t>default，既保证多态析构，又避免无意义的手写空函数</w:t>
+      </w:r>
+      <w:proofErr w:type="spellEnd"/>
+      <w:r>
+        <w:t>。</w:t>
       </w:r>
       <w:r>
         <w:rPr>
@@ -3662,7 +4107,35 @@
         <w:rPr>
           <w:lang w:eastAsia="zh-CN"/>
         </w:rPr>
-        <w:t>需要说明的是，项目部分循环仍采用 int 下标与显式类型，这是为了保持课堂代码易读。若继续改进，可在不涉及删除的遍历中使用范围 for 或 auto，在索引场景中改用 std::size_t，并用 erase-remove_if 简化失效对象清理。</w:t>
+        <w:t>需要说明的是，项目部分循环仍采用 int 下标与显式类型，这是为了保持课堂代码易读。若继续改进，可在不涉及删除的遍历中使用范围 for 或 auto，在索引场景中改用 std::</w:t>
+      </w:r>
+      <w:proofErr w:type="spellStart"/>
+      <w:r>
+        <w:rPr>
+          <w:lang w:eastAsia="zh-CN"/>
+        </w:rPr>
+        <w:t>size_t</w:t>
+      </w:r>
+      <w:proofErr w:type="spellEnd"/>
+      <w:r>
+        <w:rPr>
+          <w:lang w:eastAsia="zh-CN"/>
+        </w:rPr>
+        <w:t>，并用 erase-</w:t>
+      </w:r>
+      <w:proofErr w:type="spellStart"/>
+      <w:r>
+        <w:rPr>
+          <w:lang w:eastAsia="zh-CN"/>
+        </w:rPr>
+        <w:t>remove_if</w:t>
+      </w:r>
+      <w:proofErr w:type="spellEnd"/>
+      <w:r>
+        <w:rPr>
+          <w:lang w:eastAsia="zh-CN"/>
+        </w:rPr>
+        <w:t xml:space="preserve"> 简化失效对象清理。</w:t>
       </w:r>
     </w:p>
     <w:p>
@@ -3795,7 +4268,21 @@
         <w:rPr>
           <w:lang w:eastAsia="zh-CN"/>
         </w:rPr>
-        <w:t>问题可以通过观察“连续对象未被清理”“爆炸偶尔漏判”或调试器中的容器大小变化定位。重点检查三个时间点：对象何时被标记失效、Explosion 何时加入容器、clearObjects() 何时真正擦除。把每一帧拆成明确阶段后，可以发现碰撞检测与删除操作混在一起是风险来源。</w:t>
+        <w:t>问题可以通过观察“连续对象未被清理”“爆炸偶尔漏判”或调试器中的容器大小变化定位。重点检查三个时间点：对象何时被标记失效、Explosion 何时加入容器、</w:t>
+      </w:r>
+      <w:proofErr w:type="spellStart"/>
+      <w:r>
+        <w:rPr>
+          <w:lang w:eastAsia="zh-CN"/>
+        </w:rPr>
+        <w:t>clearObjects</w:t>
+      </w:r>
+      <w:proofErr w:type="spellEnd"/>
+      <w:r>
+        <w:rPr>
+          <w:lang w:eastAsia="zh-CN"/>
+        </w:rPr>
+        <w:t>() 何时真正擦除。把每一帧拆成明确阶段后，可以发现碰撞检测与删除操作混在一起是风险来源。</w:t>
       </w:r>
     </w:p>
     <w:p>
@@ -3806,10 +4293,12 @@
       <w:r>
         <w:t xml:space="preserve">4.3 </w:t>
       </w:r>
+      <w:proofErr w:type="spellStart"/>
       <w:r>
         <w:t>解决方案</w:t>
       </w:r>
       <w:bookmarkEnd w:id="18"/>
+      <w:proofErr w:type="spellEnd"/>
     </w:p>
     <w:tbl>
       <w:tblPr>
@@ -3942,8 +4431,18 @@
                 <w:color w:val="17365D"/>
                 <w:sz w:val="19"/>
               </w:rPr>
-              <w:t>③ 统一清理</w:t>
+              <w:t xml:space="preserve">③ </w:t>
             </w:r>
+            <w:proofErr w:type="spellStart"/>
+            <w:r>
+              <w:rPr>
+                <w:b/>
+                <w:color w:val="17365D"/>
+                <w:sz w:val="19"/>
+              </w:rPr>
+              <w:t>统一清理</w:t>
+            </w:r>
+            <w:proofErr w:type="spellEnd"/>
           </w:p>
         </w:tc>
         <w:tc>
@@ -4038,7 +4537,35 @@
         <w:rPr>
           <w:lang w:eastAsia="zh-CN"/>
         </w:rPr>
-        <w:t>采用上述流程后，对象状态变化具有确定顺序：本帧产生的爆炸能够立即参与伤害判定，失效对象不会继续 update/draw，容器清理也不会遗漏元素。进一步改进时，可使用 std::erase_if（C++20）或 erase-remove_if（C++11/17）统一删除逻辑，并为“炸弹—爆炸—碰撞—清理”编写无图形界面的单元测试。</w:t>
+        <w:t>采用上述流程后，对象状态变化具有确定顺序：本帧产生的爆炸能够立即参与伤害判定，失效对象不会继续 update/draw，容器清理也不会遗漏元素。进一步改进时，可使用 std::</w:t>
+      </w:r>
+      <w:proofErr w:type="spellStart"/>
+      <w:r>
+        <w:rPr>
+          <w:lang w:eastAsia="zh-CN"/>
+        </w:rPr>
+        <w:t>erase_if</w:t>
+      </w:r>
+      <w:proofErr w:type="spellEnd"/>
+      <w:r>
+        <w:rPr>
+          <w:lang w:eastAsia="zh-CN"/>
+        </w:rPr>
+        <w:t>（C++20）或 erase-</w:t>
+      </w:r>
+      <w:proofErr w:type="spellStart"/>
+      <w:r>
+        <w:rPr>
+          <w:lang w:eastAsia="zh-CN"/>
+        </w:rPr>
+        <w:t>remove_if</w:t>
+      </w:r>
+      <w:proofErr w:type="spellEnd"/>
+      <w:r>
+        <w:rPr>
+          <w:lang w:eastAsia="zh-CN"/>
+        </w:rPr>
+        <w:t>（C++11/17）统一删除逻辑，并为“炸弹—爆炸—碰撞—清理”编写无图形界面的单元测试。</w:t>
       </w:r>
     </w:p>
     <w:p>
@@ -4273,6 +4800,7 @@
             <w:shd w:val="clear" w:color="auto" w:fill="F5F7FA"/>
           </w:tcPr>
           <w:p>
+            <w:proofErr w:type="spellStart"/>
             <w:r>
               <w:rPr>
                 <w:b/>
@@ -4281,6 +4809,7 @@
               </w:rPr>
               <w:t>操作系统</w:t>
             </w:r>
+            <w:proofErr w:type="spellEnd"/>
           </w:p>
         </w:tc>
         <w:tc>
@@ -4463,6 +4992,7 @@
             <w:shd w:val="clear" w:color="auto" w:fill="F5F7FA"/>
           </w:tcPr>
           <w:p>
+            <w:proofErr w:type="spellStart"/>
             <w:r>
               <w:rPr>
                 <w:b/>
@@ -4471,6 +5001,7 @@
               </w:rPr>
               <w:t>图形依赖</w:t>
             </w:r>
+            <w:proofErr w:type="spellEnd"/>
           </w:p>
         </w:tc>
         <w:tc>
@@ -4625,7 +5156,35 @@
         <w:rPr>
           <w:lang w:eastAsia="zh-CN"/>
         </w:rPr>
-        <w:t>通过 EasyBomber 项目，我把继承、虚函数、多态、组合和资源管理落实到了一个可运行的小游戏中。最直接的收获是理解了“共同接口与不同实现”的价值：GameObject 统一 update/draw 后，主循环能够专注于流程，不必知道每个对象的全部细节。</w:t>
+        <w:t xml:space="preserve">通过 </w:t>
+      </w:r>
+      <w:proofErr w:type="spellStart"/>
+      <w:r>
+        <w:rPr>
+          <w:lang w:eastAsia="zh-CN"/>
+        </w:rPr>
+        <w:t>EasyBomber</w:t>
+      </w:r>
+      <w:proofErr w:type="spellEnd"/>
+      <w:r>
+        <w:rPr>
+          <w:lang w:eastAsia="zh-CN"/>
+        </w:rPr>
+        <w:t xml:space="preserve"> 项目，我把继承、虚函数、多态、组合和资源管理落实到了一个可运行的小游戏中。最直接的收获是理解了“共同接口与不同实现”的价值：</w:t>
+      </w:r>
+      <w:proofErr w:type="spellStart"/>
+      <w:r>
+        <w:rPr>
+          <w:lang w:eastAsia="zh-CN"/>
+        </w:rPr>
+        <w:t>GameObject</w:t>
+      </w:r>
+      <w:proofErr w:type="spellEnd"/>
+      <w:r>
+        <w:rPr>
+          <w:lang w:eastAsia="zh-CN"/>
+        </w:rPr>
+        <w:t xml:space="preserve"> 统一 update/draw 后，主循环能够专注于流程，不必知道每个对象的全部细节。</w:t>
       </w:r>
     </w:p>
     <w:p>
@@ -4640,7 +5199,21 @@
         <w:rPr>
           <w:lang w:eastAsia="zh-CN"/>
         </w:rPr>
-        <w:t>项目仍有不足：怪物只沿固定路线巡逻，关卡数据写在源码中，dynamic_cast 使用较多，贴图加载方式也可以抽成资源管理器。后续可增加道具、连锁爆炸、多关卡配置和简单寻路，并把碰撞与地图规则拆成可单元测试的纯逻辑模块。总体而言，本项目让我体会到，OOP 的重点并非堆叠类，而是让职责、所有权和变化边界变得清楚。</w:t>
+        <w:t>项目仍有不足：怪物只沿固定路线巡逻，关卡数据写在源码中，</w:t>
+      </w:r>
+      <w:proofErr w:type="spellStart"/>
+      <w:r>
+        <w:rPr>
+          <w:lang w:eastAsia="zh-CN"/>
+        </w:rPr>
+        <w:t>dynamic_cast</w:t>
+      </w:r>
+      <w:proofErr w:type="spellEnd"/>
+      <w:r>
+        <w:rPr>
+          <w:lang w:eastAsia="zh-CN"/>
+        </w:rPr>
+        <w:t xml:space="preserve"> 使用较多，贴图加载方式也可以抽成资源管理器。后续可增加道具、连锁爆炸、多关卡配置和简单寻路，并把碰撞与地图规则拆成可单元测试的纯逻辑模块。总体而言，本项目让我体会到，OOP 的重点并非堆叠类，而是让职责、所有权和变化边界变得清楚。</w:t>
       </w:r>
     </w:p>
     <w:p>
@@ -4782,13 +5355,23 @@
         <w:lang w:eastAsia="zh-CN"/>
       </w:rPr>
     </w:pPr>
+    <w:proofErr w:type="spellStart"/>
     <w:r>
       <w:rPr>
         <w:color w:val="666666"/>
         <w:sz w:val="17"/>
         <w:lang w:eastAsia="zh-CN"/>
       </w:rPr>
-      <w:t>EasyBomber｜面向对象程序设计课程项目报告</w:t>
+      <w:t>EasyBomber</w:t>
+    </w:r>
+    <w:proofErr w:type="spellEnd"/>
+    <w:r>
+      <w:rPr>
+        <w:color w:val="666666"/>
+        <w:sz w:val="17"/>
+        <w:lang w:eastAsia="zh-CN"/>
+      </w:rPr>
+      <w:t>｜面向对象程序设计课程项目报告</w:t>
     </w:r>
   </w:p>
 </w:hdr>
@@ -5619,7 +6202,6 @@
   <w:style w:type="character" w:default="1" w:styleId="a2">
     <w:name w:val="Default Paragraph Font"/>
     <w:uiPriority w:val="1"/>
-    <w:semiHidden/>
     <w:unhideWhenUsed/>
   </w:style>
   <w:style w:type="table" w:default="1" w:styleId="a3">
@@ -16429,6 +17011,18 @@
       <w:shd w:val="clear" w:color="auto" w:fill="E1DFDD"/>
     </w:rPr>
   </w:style>
+  <w:style w:type="character" w:styleId="affb">
+    <w:name w:val="FollowedHyperlink"/>
+    <w:basedOn w:val="a2"/>
+    <w:uiPriority w:val="99"/>
+    <w:semiHidden/>
+    <w:unhideWhenUsed/>
+    <w:rsid w:val="006272AF"/>
+    <w:rPr>
+      <w:color w:val="800080" w:themeColor="followedHyperlink"/>
+      <w:u w:val="single"/>
+    </w:rPr>
+  </w:style>
 </w:styles>
 </file>
 

</xml_diff>